<commit_message>
AI policy kit + page: brand as Fortify AI (drop i-NETT/TAG from branding)
Per direction, present the AI policy materials under the Fortify AI brand alone.
Replaced all "i-NETT · FORTIFY AI" lockups, "i-NETT / Fortify AI" provider
references, "i-NETT managed plan", "IT / i-NETT", and "i-NETT Fortify AI" across
all six kit documents and the /ai-usage-policy page with "Fortify AI". Kept the
functional contact details (i-nett.ai, phone, nickd@i-nett.com) so the documents
still have a working way to reach us. No TAG references remain.
Co-Authored-By: Claude Opus 5 <noreply@anthropic.com>
</commit_message>
<xml_diff>
--- a/public/downloads/AI-Fundamentals-Staff-Quiz.docx
+++ b/public/downloads/AI-Fundamentals-Staff-Quiz.docx
@@ -15,19 +15,18 @@
           <w:szCs w:val="30"/>
           <w:rFonts w:ascii="Calibri" w:cs="Calibri" w:eastAsia="Calibri" w:hAnsi="Calibri"/>
         </w:rPr>
-        <w:t xml:space="preserve">i-NETT</w:t>
+        <w:t xml:space="preserve">FORTIFY</w:t>
       </w:r>
       <w:r>
         <w:rPr>
           <w:b/>
           <w:bCs/>
           <w:color w:val="12A5DB"/>
-          <w:sz w:val="17"/>
-          <w:szCs w:val="17"/>
-          <w:rFonts w:ascii="Calibri" w:cs="Calibri" w:eastAsia="Calibri" w:hAnsi="Calibri"/>
-          <w:spacing w:val="20"/>
-        </w:rPr>
-        <w:t xml:space="preserve">  ·  FORTIFY AI</w:t>
+          <w:sz w:val="30"/>
+          <w:szCs w:val="30"/>
+          <w:rFonts w:ascii="Calibri" w:cs="Calibri" w:eastAsia="Calibri" w:hAnsi="Calibri"/>
+        </w:rPr>
+        <w:t xml:space="preserve"> AI</w:t>
       </w:r>
     </w:p>
     <w:p>
@@ -144,7 +143,7 @@
           <w:szCs w:val="21"/>
           <w:rFonts w:ascii="Calibri" w:cs="Calibri" w:eastAsia="Calibri" w:hAnsi="Calibri"/>
         </w:rPr>
-        <w:t xml:space="preserve">B)  Only tools approved in our policy — i-NETT Fortify AI, or others approved in writing after assessment</w:t>
+        <w:t xml:space="preserve">B)  Only tools approved in our policy — Fortify AI, or others approved in writing after assessment</w:t>
       </w:r>
     </w:p>
     <w:p>
@@ -1520,7 +1519,7 @@
           <w:szCs w:val="17"/>
           <w:rFonts w:ascii="Calibri" w:cs="Calibri" w:eastAsia="Calibri" w:hAnsi="Calibri"/>
         </w:rPr>
-        <w:t xml:space="preserve">Give staff the questions only (page 1); keep this answer key for administrators. Provided by i-NETT / Fortify AI.</w:t>
+        <w:t xml:space="preserve">Give staff the questions only (page 1); keep this answer key for administrators. Provided by Fortify AI.</w:t>
       </w:r>
     </w:p>
     <w:sectPr>
@@ -1554,7 +1553,7 @@
         <w:szCs w:val="15"/>
         <w:rFonts w:ascii="Calibri" w:cs="Calibri" w:eastAsia="Calibri" w:hAnsi="Calibri"/>
       </w:rPr>
-      <w:t xml:space="preserve">i-NETT · Fortify AI</w:t>
+      <w:t xml:space="preserve">FORTIFY AI</w:t>
     </w:r>
     <w:r>
       <w:rPr>

</xml_diff>

<commit_message>
AI kit: design pass — fix page overlap/fit, per-doc footers
- Prevent table rows and callout boxes from splitting across page breaks
  (cantSplit), which was the source of content overlapping the footer / not
  fitting; keep headings with their content (keepNext/keepLines).
- Give each document its own footer label (was hardcoded to "AI Usage
  Policy Framework" on every doc).
- Regenerate all five editable docs and rebuild the kit ZIP.
- Client AI Processing Addendum removed from the kit entirely.

Co-Authored-By: Claude Opus 4.8 <noreply@anthropic.com>
</commit_message>
<xml_diff>
--- a/public/downloads/AI-Fundamentals-Staff-Quiz.docx
+++ b/public/downloads/AI-Fundamentals-Staff-Quiz.docx
@@ -1049,6 +1049,8 @@
     <w:p>
       <w:pPr>
         <w:pStyle w:val="Heading1"/>
+        <w:keepNext/>
+        <w:keepLines/>
         <w:spacing w:before="340" w:after="130"/>
       </w:pPr>
       <w:r>
@@ -1571,7 +1573,7 @@
         <w:szCs w:val="15"/>
         <w:rFonts w:ascii="Calibri" w:cs="Calibri" w:eastAsia="Calibri" w:hAnsi="Calibri"/>
       </w:rPr>
-      <w:t xml:space="preserve">AI Usage Policy Framework</w:t>
+      <w:t xml:space="preserve">AI Fundamentals — Staff Quiz</w:t>
     </w:r>
     <w:r>
       <w:rPr>

</xml_diff>

<commit_message>
AI kit: keep quiz questions from splitting across pages
Each quiz question now holds its prompt and all options together
(keepNext/keepLines), so no question breaks across a page boundary.
Rebuild the kit ZIP with the updated quiz.

Co-Authored-By: Claude Opus 4.8 <noreply@anthropic.com>
</commit_message>
<xml_diff>
--- a/public/downloads/AI-Fundamentals-Staff-Quiz.docx
+++ b/public/downloads/AI-Fundamentals-Staff-Quiz.docx
@@ -102,6 +102,7 @@
     <w:p>
       <w:pPr>
         <w:keepNext/>
+        <w:keepLines/>
         <w:spacing w:before="180" w:after="50"/>
       </w:pPr>
       <w:r>
@@ -118,6 +119,8 @@
     </w:p>
     <w:p>
       <w:pPr>
+        <w:keepNext/>
+        <w:keepLines/>
         <w:spacing w:after="30"/>
         <w:ind w:left="380"/>
       </w:pPr>
@@ -133,6 +136,8 @@
     </w:p>
     <w:p>
       <w:pPr>
+        <w:keepNext/>
+        <w:keepLines/>
         <w:spacing w:after="30"/>
         <w:ind w:left="380"/>
       </w:pPr>
@@ -148,6 +153,8 @@
     </w:p>
     <w:p>
       <w:pPr>
+        <w:keepNext/>
+        <w:keepLines/>
         <w:spacing w:after="30"/>
         <w:ind w:left="380"/>
       </w:pPr>
@@ -163,6 +170,8 @@
     </w:p>
     <w:p>
       <w:pPr>
+        <w:keepNext w:val="false"/>
+        <w:keepLines/>
         <w:spacing w:after="30"/>
         <w:ind w:left="380"/>
       </w:pPr>
@@ -179,6 +188,7 @@
     <w:p>
       <w:pPr>
         <w:keepNext/>
+        <w:keepLines/>
         <w:spacing w:before="180" w:after="50"/>
       </w:pPr>
       <w:r>
@@ -195,6 +205,8 @@
     </w:p>
     <w:p>
       <w:pPr>
+        <w:keepNext/>
+        <w:keepLines/>
         <w:spacing w:after="30"/>
         <w:ind w:left="380"/>
       </w:pPr>
@@ -210,6 +222,8 @@
     </w:p>
     <w:p>
       <w:pPr>
+        <w:keepNext/>
+        <w:keepLines/>
         <w:spacing w:after="30"/>
         <w:ind w:left="380"/>
       </w:pPr>
@@ -225,6 +239,8 @@
     </w:p>
     <w:p>
       <w:pPr>
+        <w:keepNext/>
+        <w:keepLines/>
         <w:spacing w:after="30"/>
         <w:ind w:left="380"/>
       </w:pPr>
@@ -240,6 +256,8 @@
     </w:p>
     <w:p>
       <w:pPr>
+        <w:keepNext w:val="false"/>
+        <w:keepLines/>
         <w:spacing w:after="30"/>
         <w:ind w:left="380"/>
       </w:pPr>
@@ -256,6 +274,7 @@
     <w:p>
       <w:pPr>
         <w:keepNext/>
+        <w:keepLines/>
         <w:spacing w:before="180" w:after="50"/>
       </w:pPr>
       <w:r>
@@ -272,6 +291,8 @@
     </w:p>
     <w:p>
       <w:pPr>
+        <w:keepNext/>
+        <w:keepLines/>
         <w:spacing w:after="30"/>
         <w:ind w:left="380"/>
       </w:pPr>
@@ -287,6 +308,8 @@
     </w:p>
     <w:p>
       <w:pPr>
+        <w:keepNext/>
+        <w:keepLines/>
         <w:spacing w:after="30"/>
         <w:ind w:left="380"/>
       </w:pPr>
@@ -302,6 +325,8 @@
     </w:p>
     <w:p>
       <w:pPr>
+        <w:keepNext/>
+        <w:keepLines/>
         <w:spacing w:after="30"/>
         <w:ind w:left="380"/>
       </w:pPr>
@@ -317,6 +342,8 @@
     </w:p>
     <w:p>
       <w:pPr>
+        <w:keepNext w:val="false"/>
+        <w:keepLines/>
         <w:spacing w:after="30"/>
         <w:ind w:left="380"/>
       </w:pPr>
@@ -333,6 +360,7 @@
     <w:p>
       <w:pPr>
         <w:keepNext/>
+        <w:keepLines/>
         <w:spacing w:before="180" w:after="50"/>
       </w:pPr>
       <w:r>
@@ -349,6 +377,8 @@
     </w:p>
     <w:p>
       <w:pPr>
+        <w:keepNext/>
+        <w:keepLines/>
         <w:spacing w:after="30"/>
         <w:ind w:left="380"/>
       </w:pPr>
@@ -364,6 +394,8 @@
     </w:p>
     <w:p>
       <w:pPr>
+        <w:keepNext/>
+        <w:keepLines/>
         <w:spacing w:after="30"/>
         <w:ind w:left="380"/>
       </w:pPr>
@@ -379,6 +411,8 @@
     </w:p>
     <w:p>
       <w:pPr>
+        <w:keepNext/>
+        <w:keepLines/>
         <w:spacing w:after="30"/>
         <w:ind w:left="380"/>
       </w:pPr>
@@ -394,6 +428,8 @@
     </w:p>
     <w:p>
       <w:pPr>
+        <w:keepNext w:val="false"/>
+        <w:keepLines/>
         <w:spacing w:after="30"/>
         <w:ind w:left="380"/>
       </w:pPr>
@@ -410,6 +446,7 @@
     <w:p>
       <w:pPr>
         <w:keepNext/>
+        <w:keepLines/>
         <w:spacing w:before="180" w:after="50"/>
       </w:pPr>
       <w:r>
@@ -426,6 +463,8 @@
     </w:p>
     <w:p>
       <w:pPr>
+        <w:keepNext/>
+        <w:keepLines/>
         <w:spacing w:after="30"/>
         <w:ind w:left="380"/>
       </w:pPr>
@@ -441,6 +480,8 @@
     </w:p>
     <w:p>
       <w:pPr>
+        <w:keepNext/>
+        <w:keepLines/>
         <w:spacing w:after="30"/>
         <w:ind w:left="380"/>
       </w:pPr>
@@ -456,6 +497,8 @@
     </w:p>
     <w:p>
       <w:pPr>
+        <w:keepNext/>
+        <w:keepLines/>
         <w:spacing w:after="30"/>
         <w:ind w:left="380"/>
       </w:pPr>
@@ -471,6 +514,8 @@
     </w:p>
     <w:p>
       <w:pPr>
+        <w:keepNext w:val="false"/>
+        <w:keepLines/>
         <w:spacing w:after="30"/>
         <w:ind w:left="380"/>
       </w:pPr>
@@ -487,6 +532,7 @@
     <w:p>
       <w:pPr>
         <w:keepNext/>
+        <w:keepLines/>
         <w:spacing w:before="180" w:after="50"/>
       </w:pPr>
       <w:r>
@@ -503,6 +549,8 @@
     </w:p>
     <w:p>
       <w:pPr>
+        <w:keepNext/>
+        <w:keepLines/>
         <w:spacing w:after="30"/>
         <w:ind w:left="380"/>
       </w:pPr>
@@ -518,6 +566,8 @@
     </w:p>
     <w:p>
       <w:pPr>
+        <w:keepNext/>
+        <w:keepLines/>
         <w:spacing w:after="30"/>
         <w:ind w:left="380"/>
       </w:pPr>
@@ -533,6 +583,8 @@
     </w:p>
     <w:p>
       <w:pPr>
+        <w:keepNext/>
+        <w:keepLines/>
         <w:spacing w:after="30"/>
         <w:ind w:left="380"/>
       </w:pPr>
@@ -548,6 +600,8 @@
     </w:p>
     <w:p>
       <w:pPr>
+        <w:keepNext w:val="false"/>
+        <w:keepLines/>
         <w:spacing w:after="30"/>
         <w:ind w:left="380"/>
       </w:pPr>
@@ -564,6 +618,7 @@
     <w:p>
       <w:pPr>
         <w:keepNext/>
+        <w:keepLines/>
         <w:spacing w:before="180" w:after="50"/>
       </w:pPr>
       <w:r>
@@ -580,6 +635,8 @@
     </w:p>
     <w:p>
       <w:pPr>
+        <w:keepNext/>
+        <w:keepLines/>
         <w:spacing w:after="30"/>
         <w:ind w:left="380"/>
       </w:pPr>
@@ -595,6 +652,8 @@
     </w:p>
     <w:p>
       <w:pPr>
+        <w:keepNext/>
+        <w:keepLines/>
         <w:spacing w:after="30"/>
         <w:ind w:left="380"/>
       </w:pPr>
@@ -610,6 +669,8 @@
     </w:p>
     <w:p>
       <w:pPr>
+        <w:keepNext/>
+        <w:keepLines/>
         <w:spacing w:after="30"/>
         <w:ind w:left="380"/>
       </w:pPr>
@@ -625,6 +686,8 @@
     </w:p>
     <w:p>
       <w:pPr>
+        <w:keepNext w:val="false"/>
+        <w:keepLines/>
         <w:spacing w:after="30"/>
         <w:ind w:left="380"/>
       </w:pPr>
@@ -641,6 +704,7 @@
     <w:p>
       <w:pPr>
         <w:keepNext/>
+        <w:keepLines/>
         <w:spacing w:before="180" w:after="50"/>
       </w:pPr>
       <w:r>
@@ -657,6 +721,8 @@
     </w:p>
     <w:p>
       <w:pPr>
+        <w:keepNext/>
+        <w:keepLines/>
         <w:spacing w:after="30"/>
         <w:ind w:left="380"/>
       </w:pPr>
@@ -672,6 +738,8 @@
     </w:p>
     <w:p>
       <w:pPr>
+        <w:keepNext/>
+        <w:keepLines/>
         <w:spacing w:after="30"/>
         <w:ind w:left="380"/>
       </w:pPr>
@@ -687,6 +755,8 @@
     </w:p>
     <w:p>
       <w:pPr>
+        <w:keepNext/>
+        <w:keepLines/>
         <w:spacing w:after="30"/>
         <w:ind w:left="380"/>
       </w:pPr>
@@ -702,6 +772,8 @@
     </w:p>
     <w:p>
       <w:pPr>
+        <w:keepNext w:val="false"/>
+        <w:keepLines/>
         <w:spacing w:after="30"/>
         <w:ind w:left="380"/>
       </w:pPr>
@@ -718,6 +790,7 @@
     <w:p>
       <w:pPr>
         <w:keepNext/>
+        <w:keepLines/>
         <w:spacing w:before="180" w:after="50"/>
       </w:pPr>
       <w:r>
@@ -734,6 +807,8 @@
     </w:p>
     <w:p>
       <w:pPr>
+        <w:keepNext/>
+        <w:keepLines/>
         <w:spacing w:after="30"/>
         <w:ind w:left="380"/>
       </w:pPr>
@@ -749,6 +824,8 @@
     </w:p>
     <w:p>
       <w:pPr>
+        <w:keepNext/>
+        <w:keepLines/>
         <w:spacing w:after="30"/>
         <w:ind w:left="380"/>
       </w:pPr>
@@ -764,6 +841,8 @@
     </w:p>
     <w:p>
       <w:pPr>
+        <w:keepNext/>
+        <w:keepLines/>
         <w:spacing w:after="30"/>
         <w:ind w:left="380"/>
       </w:pPr>
@@ -779,6 +858,8 @@
     </w:p>
     <w:p>
       <w:pPr>
+        <w:keepNext w:val="false"/>
+        <w:keepLines/>
         <w:spacing w:after="30"/>
         <w:ind w:left="380"/>
       </w:pPr>
@@ -795,6 +876,7 @@
     <w:p>
       <w:pPr>
         <w:keepNext/>
+        <w:keepLines/>
         <w:spacing w:before="180" w:after="50"/>
       </w:pPr>
       <w:r>
@@ -811,6 +893,8 @@
     </w:p>
     <w:p>
       <w:pPr>
+        <w:keepNext/>
+        <w:keepLines/>
         <w:spacing w:after="30"/>
         <w:ind w:left="380"/>
       </w:pPr>
@@ -826,6 +910,8 @@
     </w:p>
     <w:p>
       <w:pPr>
+        <w:keepNext/>
+        <w:keepLines/>
         <w:spacing w:after="30"/>
         <w:ind w:left="380"/>
       </w:pPr>
@@ -841,6 +927,8 @@
     </w:p>
     <w:p>
       <w:pPr>
+        <w:keepNext/>
+        <w:keepLines/>
         <w:spacing w:after="30"/>
         <w:ind w:left="380"/>
       </w:pPr>
@@ -856,6 +944,8 @@
     </w:p>
     <w:p>
       <w:pPr>
+        <w:keepNext w:val="false"/>
+        <w:keepLines/>
         <w:spacing w:after="30"/>
         <w:ind w:left="380"/>
       </w:pPr>
@@ -872,6 +962,7 @@
     <w:p>
       <w:pPr>
         <w:keepNext/>
+        <w:keepLines/>
         <w:spacing w:before="180" w:after="50"/>
       </w:pPr>
       <w:r>
@@ -888,6 +979,8 @@
     </w:p>
     <w:p>
       <w:pPr>
+        <w:keepNext/>
+        <w:keepLines/>
         <w:spacing w:after="30"/>
         <w:ind w:left="380"/>
       </w:pPr>
@@ -903,6 +996,8 @@
     </w:p>
     <w:p>
       <w:pPr>
+        <w:keepNext/>
+        <w:keepLines/>
         <w:spacing w:after="30"/>
         <w:ind w:left="380"/>
       </w:pPr>
@@ -918,6 +1013,8 @@
     </w:p>
     <w:p>
       <w:pPr>
+        <w:keepNext/>
+        <w:keepLines/>
         <w:spacing w:after="30"/>
         <w:ind w:left="380"/>
       </w:pPr>
@@ -933,6 +1030,8 @@
     </w:p>
     <w:p>
       <w:pPr>
+        <w:keepNext w:val="false"/>
+        <w:keepLines/>
         <w:spacing w:after="30"/>
         <w:ind w:left="380"/>
       </w:pPr>
@@ -949,6 +1048,7 @@
     <w:p>
       <w:pPr>
         <w:keepNext/>
+        <w:keepLines/>
         <w:spacing w:before="180" w:after="50"/>
       </w:pPr>
       <w:r>
@@ -965,6 +1065,8 @@
     </w:p>
     <w:p>
       <w:pPr>
+        <w:keepNext/>
+        <w:keepLines/>
         <w:spacing w:after="30"/>
         <w:ind w:left="380"/>
       </w:pPr>
@@ -980,6 +1082,8 @@
     </w:p>
     <w:p>
       <w:pPr>
+        <w:keepNext/>
+        <w:keepLines/>
         <w:spacing w:after="30"/>
         <w:ind w:left="380"/>
       </w:pPr>
@@ -995,6 +1099,8 @@
     </w:p>
     <w:p>
       <w:pPr>
+        <w:keepNext/>
+        <w:keepLines/>
         <w:spacing w:after="30"/>
         <w:ind w:left="380"/>
       </w:pPr>
@@ -1010,6 +1116,8 @@
     </w:p>
     <w:p>
       <w:pPr>
+        <w:keepNext w:val="false"/>
+        <w:keepLines/>
         <w:spacing w:after="30"/>
         <w:ind w:left="380"/>
       </w:pPr>

</xml_diff>